<commit_message>
Document uppercase IDs for audio spectrogram labs
</commit_message>
<xml_diff>
--- a/huong-dan-lab6-audio-spectrogram-dwt-extract.docx
+++ b/huong-dan-lab6-audio-spectrogram-dwt-extract.docx
@@ -165,7 +165,21 @@
           <w:i w:val="0"/>
           <w:sz w:val="22"/>
         </w:rPr>
-        <w:t>Khi được hỏi email, sinh viên nhập mã sinh viên của mình.</w:t>
+        <w:t>Khi duoc hoi email, sinh vien nhap ma sinh vien cua minh. He thong se tu chuan hoa ma do sang dang IN HOA va ghi nho ID gan nhat.</w:t>
+      </w:r>
+    </w:p>
+    <w:p>
+      <w:pPr>
+        <w:spacing w:before="0" w:after="160" w:line="276" w:lineRule="auto"/>
+      </w:pPr>
+      <w:r>
+        <w:rPr>
+          <w:rFonts w:ascii="Arial" w:hAnsi="Arial" w:cs="Arial"/>
+          <w:b w:val="0"/>
+          <w:i w:val="0"/>
+          <w:sz w:val="22"/>
+        </w:rPr>
+        <w:t>Lenh checkwork chi hien thi va cham ket qua cua dung ID dang duoc dung cho bai lab hien tai, khong tron voi cac file .lab cu cua ID khac.</w:t>
       </w:r>
     </w:p>
     <w:p>

</xml_diff>